<commit_message>
Add the informatics topic-selection guide, fix site-wide search matching, and rebuild Deployment.
Co-authored-by: Cursor <cursoragent@cursor.com>
</commit_message>
<xml_diff>
--- a/documents/Complex_Topics_Clear_Explanations_EN.docx
+++ b/documents/Complex_Topics_Clear_Explanations_EN.docx
@@ -43,6 +43,7 @@
     <w:p>
       <w:pPr>
         <w:pStyle w:val="Subtitle"/>
+        <w:jc w:val="center"/>
         <w:rPr>
           <w:rFonts w:ascii="Times New Roman" w:hAnsi="Times New Roman" w:cs="Times New Roman"/>
         </w:rPr>
@@ -56,6 +57,7 @@
     </w:p>
     <w:p>
       <w:pPr>
+        <w:jc w:val="center"/>
         <w:rPr>
           <w:rFonts w:ascii="Times New Roman" w:hAnsi="Times New Roman" w:cs="Times New Roman"/>
         </w:rPr>
@@ -175,6 +177,13 @@
     </w:p>
     <w:sdt>
       <w:sdtPr>
+        <w:rPr>
+          <w:rFonts w:ascii="Calibri" w:eastAsiaTheme="minorEastAsia" w:hAnsi="Calibri" w:cstheme="minorBidi"/>
+          <w:b w:val="0"/>
+          <w:bCs w:val="0"/>
+          <w:sz w:val="22"/>
+          <w:szCs w:val="22"/>
+        </w:rPr>
         <w:id w:val="159518746"/>
         <w:docPartObj>
           <w:docPartGallery w:val="Table of Contents"/>
@@ -183,10 +192,7 @@
       </w:sdtPr>
       <w:sdtEndPr>
         <w:rPr>
-          <w:rFonts w:ascii="Calibri" w:eastAsiaTheme="minorEastAsia" w:hAnsi="Calibri" w:cstheme="minorBidi"/>
           <w:noProof/>
-          <w:sz w:val="22"/>
-          <w:szCs w:val="22"/>
         </w:rPr>
       </w:sdtEndPr>
       <w:sdtContent>
@@ -211,7 +217,6 @@
               <w:kern w:val="2"/>
               <w:sz w:val="24"/>
               <w:szCs w:val="24"/>
-              <w:lang/>
               <w14:ligatures w14:val="standardContextual"/>
             </w:rPr>
           </w:pPr>
@@ -296,7 +301,6 @@
               <w:kern w:val="2"/>
               <w:sz w:val="24"/>
               <w:szCs w:val="24"/>
-              <w:lang/>
               <w14:ligatures w14:val="standardContextual"/>
             </w:rPr>
           </w:pPr>
@@ -372,7 +376,6 @@
               <w:kern w:val="2"/>
               <w:sz w:val="24"/>
               <w:szCs w:val="24"/>
-              <w:lang/>
               <w14:ligatures w14:val="standardContextual"/>
             </w:rPr>
           </w:pPr>
@@ -448,7 +451,6 @@
               <w:kern w:val="2"/>
               <w:sz w:val="24"/>
               <w:szCs w:val="24"/>
-              <w:lang/>
               <w14:ligatures w14:val="standardContextual"/>
             </w:rPr>
           </w:pPr>
@@ -524,7 +526,6 @@
               <w:kern w:val="2"/>
               <w:sz w:val="24"/>
               <w:szCs w:val="24"/>
-              <w:lang/>
               <w14:ligatures w14:val="standardContextual"/>
             </w:rPr>
           </w:pPr>
@@ -600,7 +601,6 @@
               <w:kern w:val="2"/>
               <w:sz w:val="24"/>
               <w:szCs w:val="24"/>
-              <w:lang/>
               <w14:ligatures w14:val="standardContextual"/>
             </w:rPr>
           </w:pPr>
@@ -676,7 +676,6 @@
               <w:kern w:val="2"/>
               <w:sz w:val="24"/>
               <w:szCs w:val="24"/>
-              <w:lang/>
               <w14:ligatures w14:val="standardContextual"/>
             </w:rPr>
           </w:pPr>
@@ -752,7 +751,6 @@
               <w:kern w:val="2"/>
               <w:sz w:val="24"/>
               <w:szCs w:val="24"/>
-              <w:lang/>
               <w14:ligatures w14:val="standardContextual"/>
             </w:rPr>
           </w:pPr>
@@ -828,7 +826,6 @@
               <w:kern w:val="2"/>
               <w:sz w:val="24"/>
               <w:szCs w:val="24"/>
-              <w:lang/>
               <w14:ligatures w14:val="standardContextual"/>
             </w:rPr>
           </w:pPr>
@@ -904,7 +901,6 @@
               <w:kern w:val="2"/>
               <w:sz w:val="24"/>
               <w:szCs w:val="24"/>
-              <w:lang/>
               <w14:ligatures w14:val="standardContextual"/>
             </w:rPr>
           </w:pPr>
@@ -980,7 +976,6 @@
               <w:kern w:val="2"/>
               <w:sz w:val="24"/>
               <w:szCs w:val="24"/>
-              <w:lang/>
               <w14:ligatures w14:val="standardContextual"/>
             </w:rPr>
           </w:pPr>
@@ -1056,7 +1051,6 @@
               <w:kern w:val="2"/>
               <w:sz w:val="24"/>
               <w:szCs w:val="24"/>
-              <w:lang/>
               <w14:ligatures w14:val="standardContextual"/>
             </w:rPr>
           </w:pPr>
@@ -1132,7 +1126,6 @@
               <w:kern w:val="2"/>
               <w:sz w:val="24"/>
               <w:szCs w:val="24"/>
-              <w:lang/>
               <w14:ligatures w14:val="standardContextual"/>
             </w:rPr>
           </w:pPr>
@@ -1208,7 +1201,6 @@
               <w:kern w:val="2"/>
               <w:sz w:val="24"/>
               <w:szCs w:val="24"/>
-              <w:lang/>
               <w14:ligatures w14:val="standardContextual"/>
             </w:rPr>
           </w:pPr>
@@ -1284,7 +1276,6 @@
               <w:kern w:val="2"/>
               <w:sz w:val="24"/>
               <w:szCs w:val="24"/>
-              <w:lang/>
               <w14:ligatures w14:val="standardContextual"/>
             </w:rPr>
           </w:pPr>
@@ -1360,7 +1351,6 @@
               <w:kern w:val="2"/>
               <w:sz w:val="24"/>
               <w:szCs w:val="24"/>
-              <w:lang/>
               <w14:ligatures w14:val="standardContextual"/>
             </w:rPr>
           </w:pPr>
@@ -1436,7 +1426,6 @@
               <w:kern w:val="2"/>
               <w:sz w:val="24"/>
               <w:szCs w:val="24"/>
-              <w:lang/>
               <w14:ligatures w14:val="standardContextual"/>
             </w:rPr>
           </w:pPr>
@@ -1512,7 +1501,6 @@
               <w:kern w:val="2"/>
               <w:sz w:val="24"/>
               <w:szCs w:val="24"/>
-              <w:lang/>
               <w14:ligatures w14:val="standardContextual"/>
             </w:rPr>
           </w:pPr>
@@ -1588,7 +1576,6 @@
               <w:kern w:val="2"/>
               <w:sz w:val="24"/>
               <w:szCs w:val="24"/>
-              <w:lang/>
               <w14:ligatures w14:val="standardContextual"/>
             </w:rPr>
           </w:pPr>
@@ -1664,7 +1651,6 @@
               <w:kern w:val="2"/>
               <w:sz w:val="24"/>
               <w:szCs w:val="24"/>
-              <w:lang/>
               <w14:ligatures w14:val="standardContextual"/>
             </w:rPr>
           </w:pPr>
@@ -1740,7 +1726,6 @@
               <w:kern w:val="2"/>
               <w:sz w:val="24"/>
               <w:szCs w:val="24"/>
-              <w:lang/>
               <w14:ligatures w14:val="standardContextual"/>
             </w:rPr>
           </w:pPr>
@@ -1816,7 +1801,6 @@
               <w:kern w:val="2"/>
               <w:sz w:val="24"/>
               <w:szCs w:val="24"/>
-              <w:lang/>
               <w14:ligatures w14:val="standardContextual"/>
             </w:rPr>
           </w:pPr>
@@ -1892,7 +1876,6 @@
               <w:kern w:val="2"/>
               <w:sz w:val="24"/>
               <w:szCs w:val="24"/>
-              <w:lang/>
               <w14:ligatures w14:val="standardContextual"/>
             </w:rPr>
           </w:pPr>
@@ -1968,7 +1951,6 @@
               <w:kern w:val="2"/>
               <w:sz w:val="24"/>
               <w:szCs w:val="24"/>
-              <w:lang/>
               <w14:ligatures w14:val="standardContextual"/>
             </w:rPr>
           </w:pPr>
@@ -2044,7 +2026,6 @@
               <w:kern w:val="2"/>
               <w:sz w:val="24"/>
               <w:szCs w:val="24"/>
-              <w:lang/>
               <w14:ligatures w14:val="standardContextual"/>
             </w:rPr>
           </w:pPr>
@@ -2120,7 +2101,6 @@
               <w:kern w:val="2"/>
               <w:sz w:val="24"/>
               <w:szCs w:val="24"/>
-              <w:lang/>
               <w14:ligatures w14:val="standardContextual"/>
             </w:rPr>
           </w:pPr>
@@ -2196,7 +2176,6 @@
               <w:kern w:val="2"/>
               <w:sz w:val="24"/>
               <w:szCs w:val="24"/>
-              <w:lang/>
               <w14:ligatures w14:val="standardContextual"/>
             </w:rPr>
           </w:pPr>
@@ -2272,7 +2251,6 @@
               <w:kern w:val="2"/>
               <w:sz w:val="24"/>
               <w:szCs w:val="24"/>
-              <w:lang/>
               <w14:ligatures w14:val="standardContextual"/>
             </w:rPr>
           </w:pPr>
@@ -2348,7 +2326,6 @@
               <w:kern w:val="2"/>
               <w:sz w:val="24"/>
               <w:szCs w:val="24"/>
-              <w:lang/>
               <w14:ligatures w14:val="standardContextual"/>
             </w:rPr>
           </w:pPr>
@@ -2424,7 +2401,6 @@
               <w:kern w:val="2"/>
               <w:sz w:val="24"/>
               <w:szCs w:val="24"/>
-              <w:lang/>
               <w14:ligatures w14:val="standardContextual"/>
             </w:rPr>
           </w:pPr>
@@ -2500,7 +2476,6 @@
               <w:kern w:val="2"/>
               <w:sz w:val="24"/>
               <w:szCs w:val="24"/>
-              <w:lang/>
               <w14:ligatures w14:val="standardContextual"/>
             </w:rPr>
           </w:pPr>
@@ -2576,7 +2551,6 @@
               <w:kern w:val="2"/>
               <w:sz w:val="24"/>
               <w:szCs w:val="24"/>
-              <w:lang/>
               <w14:ligatures w14:val="standardContextual"/>
             </w:rPr>
           </w:pPr>
@@ -2652,7 +2626,6 @@
               <w:kern w:val="2"/>
               <w:sz w:val="24"/>
               <w:szCs w:val="24"/>
-              <w:lang/>
               <w14:ligatures w14:val="standardContextual"/>
             </w:rPr>
           </w:pPr>
@@ -2728,7 +2701,6 @@
               <w:kern w:val="2"/>
               <w:sz w:val="24"/>
               <w:szCs w:val="24"/>
-              <w:lang/>
               <w14:ligatures w14:val="standardContextual"/>
             </w:rPr>
           </w:pPr>
@@ -2804,7 +2776,6 @@
               <w:kern w:val="2"/>
               <w:sz w:val="24"/>
               <w:szCs w:val="24"/>
-              <w:lang/>
               <w14:ligatures w14:val="standardContextual"/>
             </w:rPr>
           </w:pPr>
@@ -2880,7 +2851,6 @@
               <w:kern w:val="2"/>
               <w:sz w:val="24"/>
               <w:szCs w:val="24"/>
-              <w:lang/>
               <w14:ligatures w14:val="standardContextual"/>
             </w:rPr>
           </w:pPr>
@@ -2956,7 +2926,6 @@
               <w:kern w:val="2"/>
               <w:sz w:val="24"/>
               <w:szCs w:val="24"/>
-              <w:lang/>
               <w14:ligatures w14:val="standardContextual"/>
             </w:rPr>
           </w:pPr>
@@ -3032,7 +3001,6 @@
               <w:kern w:val="2"/>
               <w:sz w:val="24"/>
               <w:szCs w:val="24"/>
-              <w:lang/>
               <w14:ligatures w14:val="standardContextual"/>
             </w:rPr>
           </w:pPr>
@@ -3108,7 +3076,6 @@
               <w:kern w:val="2"/>
               <w:sz w:val="24"/>
               <w:szCs w:val="24"/>
-              <w:lang/>
               <w14:ligatures w14:val="standardContextual"/>
             </w:rPr>
           </w:pPr>
@@ -3184,7 +3151,6 @@
               <w:kern w:val="2"/>
               <w:sz w:val="24"/>
               <w:szCs w:val="24"/>
-              <w:lang/>
               <w14:ligatures w14:val="standardContextual"/>
             </w:rPr>
           </w:pPr>
@@ -3260,7 +3226,6 @@
               <w:kern w:val="2"/>
               <w:sz w:val="24"/>
               <w:szCs w:val="24"/>
-              <w:lang/>
               <w14:ligatures w14:val="standardContextual"/>
             </w:rPr>
           </w:pPr>
@@ -3336,7 +3301,6 @@
               <w:kern w:val="2"/>
               <w:sz w:val="24"/>
               <w:szCs w:val="24"/>
-              <w:lang/>
               <w14:ligatures w14:val="standardContextual"/>
             </w:rPr>
           </w:pPr>
@@ -3412,7 +3376,6 @@
               <w:kern w:val="2"/>
               <w:sz w:val="24"/>
               <w:szCs w:val="24"/>
-              <w:lang/>
               <w14:ligatures w14:val="standardContextual"/>
             </w:rPr>
           </w:pPr>
@@ -3488,7 +3451,6 @@
               <w:kern w:val="2"/>
               <w:sz w:val="24"/>
               <w:szCs w:val="24"/>
-              <w:lang/>
               <w14:ligatures w14:val="standardContextual"/>
             </w:rPr>
           </w:pPr>
@@ -3564,7 +3526,6 @@
               <w:kern w:val="2"/>
               <w:sz w:val="24"/>
               <w:szCs w:val="24"/>
-              <w:lang/>
               <w14:ligatures w14:val="standardContextual"/>
             </w:rPr>
           </w:pPr>
@@ -3640,7 +3601,6 @@
               <w:kern w:val="2"/>
               <w:sz w:val="24"/>
               <w:szCs w:val="24"/>
-              <w:lang/>
               <w14:ligatures w14:val="standardContextual"/>
             </w:rPr>
           </w:pPr>
@@ -3716,7 +3676,6 @@
               <w:kern w:val="2"/>
               <w:sz w:val="24"/>
               <w:szCs w:val="24"/>
-              <w:lang/>
               <w14:ligatures w14:val="standardContextual"/>
             </w:rPr>
           </w:pPr>
@@ -3792,7 +3751,6 @@
               <w:kern w:val="2"/>
               <w:sz w:val="24"/>
               <w:szCs w:val="24"/>
-              <w:lang/>
               <w14:ligatures w14:val="standardContextual"/>
             </w:rPr>
           </w:pPr>
@@ -3868,7 +3826,6 @@
               <w:kern w:val="2"/>
               <w:sz w:val="24"/>
               <w:szCs w:val="24"/>
-              <w:lang/>
               <w14:ligatures w14:val="standardContextual"/>
             </w:rPr>
           </w:pPr>
@@ -3944,7 +3901,6 @@
               <w:kern w:val="2"/>
               <w:sz w:val="24"/>
               <w:szCs w:val="24"/>
-              <w:lang/>
               <w14:ligatures w14:val="standardContextual"/>
             </w:rPr>
           </w:pPr>
@@ -4020,7 +3976,6 @@
               <w:kern w:val="2"/>
               <w:sz w:val="24"/>
               <w:szCs w:val="24"/>
-              <w:lang/>
               <w14:ligatures w14:val="standardContextual"/>
             </w:rPr>
           </w:pPr>
@@ -4096,7 +4051,6 @@
               <w:kern w:val="2"/>
               <w:sz w:val="24"/>
               <w:szCs w:val="24"/>
-              <w:lang/>
               <w14:ligatures w14:val="standardContextual"/>
             </w:rPr>
           </w:pPr>
@@ -4172,7 +4126,6 @@
               <w:kern w:val="2"/>
               <w:sz w:val="24"/>
               <w:szCs w:val="24"/>
-              <w:lang/>
               <w14:ligatures w14:val="standardContextual"/>
             </w:rPr>
           </w:pPr>
@@ -4248,7 +4201,6 @@
               <w:kern w:val="2"/>
               <w:sz w:val="24"/>
               <w:szCs w:val="24"/>
-              <w:lang/>
               <w14:ligatures w14:val="standardContextual"/>
             </w:rPr>
           </w:pPr>
@@ -4324,7 +4276,6 @@
               <w:kern w:val="2"/>
               <w:sz w:val="24"/>
               <w:szCs w:val="24"/>
-              <w:lang/>
               <w14:ligatures w14:val="standardContextual"/>
             </w:rPr>
           </w:pPr>
@@ -4400,7 +4351,6 @@
               <w:kern w:val="2"/>
               <w:sz w:val="24"/>
               <w:szCs w:val="24"/>
-              <w:lang/>
               <w14:ligatures w14:val="standardContextual"/>
             </w:rPr>
           </w:pPr>
@@ -4476,7 +4426,6 @@
               <w:kern w:val="2"/>
               <w:sz w:val="24"/>
               <w:szCs w:val="24"/>
-              <w:lang/>
               <w14:ligatures w14:val="standardContextual"/>
             </w:rPr>
           </w:pPr>
@@ -4552,7 +4501,6 @@
               <w:kern w:val="2"/>
               <w:sz w:val="24"/>
               <w:szCs w:val="24"/>
-              <w:lang/>
               <w14:ligatures w14:val="standardContextual"/>
             </w:rPr>
           </w:pPr>
@@ -4628,7 +4576,6 @@
               <w:kern w:val="2"/>
               <w:sz w:val="24"/>
               <w:szCs w:val="24"/>
-              <w:lang/>
               <w14:ligatures w14:val="standardContextual"/>
             </w:rPr>
           </w:pPr>
@@ -4704,7 +4651,6 @@
               <w:kern w:val="2"/>
               <w:sz w:val="24"/>
               <w:szCs w:val="24"/>
-              <w:lang/>
               <w14:ligatures w14:val="standardContextual"/>
             </w:rPr>
           </w:pPr>
@@ -4780,7 +4726,6 @@
               <w:kern w:val="2"/>
               <w:sz w:val="24"/>
               <w:szCs w:val="24"/>
-              <w:lang/>
               <w14:ligatures w14:val="standardContextual"/>
             </w:rPr>
           </w:pPr>
@@ -4856,7 +4801,6 @@
               <w:kern w:val="2"/>
               <w:sz w:val="24"/>
               <w:szCs w:val="24"/>
-              <w:lang/>
               <w14:ligatures w14:val="standardContextual"/>
             </w:rPr>
           </w:pPr>
@@ -4932,7 +4876,6 @@
               <w:kern w:val="2"/>
               <w:sz w:val="24"/>
               <w:szCs w:val="24"/>
-              <w:lang/>
               <w14:ligatures w14:val="standardContextual"/>
             </w:rPr>
           </w:pPr>
@@ -5008,7 +4951,6 @@
               <w:kern w:val="2"/>
               <w:sz w:val="24"/>
               <w:szCs w:val="24"/>
-              <w:lang/>
               <w14:ligatures w14:val="standardContextual"/>
             </w:rPr>
           </w:pPr>
@@ -5084,7 +5026,6 @@
               <w:kern w:val="2"/>
               <w:sz w:val="24"/>
               <w:szCs w:val="24"/>
-              <w:lang/>
               <w14:ligatures w14:val="standardContextual"/>
             </w:rPr>
           </w:pPr>
@@ -5160,7 +5101,6 @@
               <w:kern w:val="2"/>
               <w:sz w:val="24"/>
               <w:szCs w:val="24"/>
-              <w:lang/>
               <w14:ligatures w14:val="standardContextual"/>
             </w:rPr>
           </w:pPr>
@@ -5236,7 +5176,6 @@
               <w:kern w:val="2"/>
               <w:sz w:val="24"/>
               <w:szCs w:val="24"/>
-              <w:lang/>
               <w14:ligatures w14:val="standardContextual"/>
             </w:rPr>
           </w:pPr>
@@ -5312,7 +5251,6 @@
               <w:kern w:val="2"/>
               <w:sz w:val="24"/>
               <w:szCs w:val="24"/>
-              <w:lang/>
               <w14:ligatures w14:val="standardContextual"/>
             </w:rPr>
           </w:pPr>
@@ -5388,7 +5326,6 @@
               <w:kern w:val="2"/>
               <w:sz w:val="24"/>
               <w:szCs w:val="24"/>
-              <w:lang/>
               <w14:ligatures w14:val="standardContextual"/>
             </w:rPr>
           </w:pPr>
@@ -5464,7 +5401,6 @@
               <w:kern w:val="2"/>
               <w:sz w:val="24"/>
               <w:szCs w:val="24"/>
-              <w:lang/>
               <w14:ligatures w14:val="standardContextual"/>
             </w:rPr>
           </w:pPr>
@@ -5540,7 +5476,6 @@
               <w:kern w:val="2"/>
               <w:sz w:val="24"/>
               <w:szCs w:val="24"/>
-              <w:lang/>
               <w14:ligatures w14:val="standardContextual"/>
             </w:rPr>
           </w:pPr>
@@ -5616,7 +5551,6 @@
               <w:kern w:val="2"/>
               <w:sz w:val="24"/>
               <w:szCs w:val="24"/>
-              <w:lang/>
               <w14:ligatures w14:val="standardContextual"/>
             </w:rPr>
           </w:pPr>
@@ -5692,7 +5626,6 @@
               <w:kern w:val="2"/>
               <w:sz w:val="24"/>
               <w:szCs w:val="24"/>
-              <w:lang/>
               <w14:ligatures w14:val="standardContextual"/>
             </w:rPr>
           </w:pPr>
@@ -5768,7 +5701,6 @@
               <w:kern w:val="2"/>
               <w:sz w:val="24"/>
               <w:szCs w:val="24"/>
-              <w:lang/>
               <w14:ligatures w14:val="standardContextual"/>
             </w:rPr>
           </w:pPr>
@@ -5844,7 +5776,6 @@
               <w:kern w:val="2"/>
               <w:sz w:val="24"/>
               <w:szCs w:val="24"/>
-              <w:lang/>
               <w14:ligatures w14:val="standardContextual"/>
             </w:rPr>
           </w:pPr>
@@ -5920,7 +5851,6 @@
               <w:kern w:val="2"/>
               <w:sz w:val="24"/>
               <w:szCs w:val="24"/>
-              <w:lang/>
               <w14:ligatures w14:val="standardContextual"/>
             </w:rPr>
           </w:pPr>
@@ -5996,7 +5926,6 @@
               <w:kern w:val="2"/>
               <w:sz w:val="24"/>
               <w:szCs w:val="24"/>
-              <w:lang/>
               <w14:ligatures w14:val="standardContextual"/>
             </w:rPr>
           </w:pPr>
@@ -6763,7 +6692,7 @@
         <w:rPr>
           <w:rFonts w:ascii="Times New Roman" w:hAnsi="Times New Roman" w:cs="Times New Roman"/>
         </w:rPr>
-        <w:t>For the first year three main formats are proposed, plus a teaching pack that combines them. The volumes below are recommendations in the source, not approved minimums or maximums.</w:t>
+        <w:t>The flyer panel “Submit your explanation” allows one format or a combination. However complex the topic, the aim is to explain it clearly, logically and in language close to the audience, while preserving scientific accuracy. Choose the approach that best explains the topic to the intended audience. The explanations below are the tooltips from that panel. The volumes are recommendations, not approved minimums or maximums.</w:t>
       </w:r>
     </w:p>
     <w:tbl>
@@ -6775,7 +6704,6 @@
       </w:tblPr>
       <w:tblGrid>
         <w:gridCol w:w="3024"/>
-        <w:gridCol w:w="1944"/>
         <w:gridCol w:w="4968"/>
       </w:tblGrid>
       <w:tr>
@@ -6822,42 +6750,6 @@
         </w:tc>
         <w:tc>
           <w:tcPr>
-            <w:tcW w:w="1944" w:type="dxa"/>
-            <w:tcBorders>
-              <w:top w:val="single" w:sz="4" w:space="0" w:color="D9D9D9"/>
-              <w:left w:val="single" w:sz="4" w:space="0" w:color="D9D9D9"/>
-              <w:bottom w:val="single" w:sz="4" w:space="0" w:color="D9D9D9"/>
-              <w:right w:val="single" w:sz="4" w:space="0" w:color="D9D9D9"/>
-            </w:tcBorders>
-            <w:shd w:val="clear" w:color="auto" w:fill="DFE8F0"/>
-            <w:tcMar>
-              <w:top w:w="90" w:type="dxa"/>
-              <w:left w:w="90" w:type="dxa"/>
-              <w:bottom w:w="90" w:type="dxa"/>
-              <w:right w:w="90" w:type="dxa"/>
-            </w:tcMar>
-            <w:vAlign w:val="center"/>
-          </w:tcPr>
-          <w:p>
-            <w:pPr>
-              <w:keepNext/>
-              <w:spacing w:before="80" w:after="80" w:line="240" w:lineRule="auto"/>
-              <w:rPr>
-                <w:rFonts w:ascii="Times New Roman" w:hAnsi="Times New Roman" w:cs="Times New Roman"/>
-              </w:rPr>
-            </w:pPr>
-            <w:r>
-              <w:rPr>
-                <w:rFonts w:ascii="Times New Roman" w:hAnsi="Times New Roman" w:cs="Times New Roman"/>
-                <w:b/>
-                <w:sz w:val="20"/>
-              </w:rPr>
-              <w:t>Proposed volume</w:t>
-            </w:r>
-          </w:p>
-        </w:tc>
-        <w:tc>
-          <w:tcPr>
             <w:tcW w:w="4968" w:type="dxa"/>
             <w:tcBorders>
               <w:top w:val="single" w:sz="4" w:space="0" w:color="D9D9D9"/>
@@ -6888,7 +6780,7 @@
                 <w:b/>
                 <w:sz w:val="20"/>
               </w:rPr>
-              <w:t>Content</w:t>
+              <w:t>Explanation</w:t>
             </w:r>
           </w:p>
         </w:tc>
@@ -6929,42 +6821,7 @@
                 <w:rFonts w:ascii="Times New Roman" w:hAnsi="Times New Roman" w:cs="Times New Roman"/>
                 <w:sz w:val="20"/>
               </w:rPr>
-              <w:t>Teaching article or lecture text</w:t>
-            </w:r>
-          </w:p>
-        </w:tc>
-        <w:tc>
-          <w:tcPr>
-            <w:tcW w:w="1944" w:type="dxa"/>
-            <w:tcBorders>
-              <w:top w:val="single" w:sz="4" w:space="0" w:color="D9D9D9"/>
-              <w:left w:val="single" w:sz="4" w:space="0" w:color="D9D9D9"/>
-              <w:bottom w:val="single" w:sz="4" w:space="0" w:color="D9D9D9"/>
-              <w:right w:val="single" w:sz="4" w:space="0" w:color="D9D9D9"/>
-            </w:tcBorders>
-            <w:shd w:val="clear" w:color="auto" w:fill="FFFFFF"/>
-            <w:tcMar>
-              <w:top w:w="90" w:type="dxa"/>
-              <w:left w:w="90" w:type="dxa"/>
-              <w:bottom w:w="90" w:type="dxa"/>
-              <w:right w:w="90" w:type="dxa"/>
-            </w:tcMar>
-            <w:vAlign w:val="center"/>
-          </w:tcPr>
-          <w:p>
-            <w:pPr>
-              <w:keepNext/>
-              <w:spacing w:before="80" w:after="80" w:line="240" w:lineRule="auto"/>
-              <w:rPr>
-                <w:rFonts w:ascii="Times New Roman" w:hAnsi="Times New Roman" w:cs="Times New Roman"/>
-              </w:rPr>
-            </w:pPr>
-            <w:r>
-              <w:rPr>
-                <w:rFonts w:ascii="Times New Roman" w:hAnsi="Times New Roman" w:cs="Times New Roman"/>
-                <w:sz w:val="20"/>
-              </w:rPr>
-              <w:t>2,000–5,000 words</w:t>
+              <w:t>Article</w:t>
             </w:r>
           </w:p>
         </w:tc>
@@ -6999,7 +6856,7 @@
                 <w:rFonts w:ascii="Times New Roman" w:hAnsi="Times New Roman" w:cs="Times New Roman"/>
                 <w:sz w:val="20"/>
               </w:rPr>
-              <w:t>A systematic explanation, examples and sources</w:t>
+              <w:t>A written teaching text or lecture that explains one hard topic in clear, structured language. A useful range is about 2,000–5,000 words.</w:t>
             </w:r>
           </w:p>
         </w:tc>
@@ -7040,42 +6897,7 @@
                 <w:rFonts w:ascii="Times New Roman" w:hAnsi="Times New Roman" w:cs="Times New Roman"/>
                 <w:sz w:val="20"/>
               </w:rPr>
-              <w:t>Video lecture or explained lesson</w:t>
-            </w:r>
-          </w:p>
-        </w:tc>
-        <w:tc>
-          <w:tcPr>
-            <w:tcW w:w="1944" w:type="dxa"/>
-            <w:tcBorders>
-              <w:top w:val="single" w:sz="4" w:space="0" w:color="D9D9D9"/>
-              <w:left w:val="single" w:sz="4" w:space="0" w:color="D9D9D9"/>
-              <w:bottom w:val="single" w:sz="4" w:space="0" w:color="D9D9D9"/>
-              <w:right w:val="single" w:sz="4" w:space="0" w:color="D9D9D9"/>
-            </w:tcBorders>
-            <w:shd w:val="clear" w:color="auto" w:fill="F5F7F9"/>
-            <w:tcMar>
-              <w:top w:w="90" w:type="dxa"/>
-              <w:left w:w="90" w:type="dxa"/>
-              <w:bottom w:w="90" w:type="dxa"/>
-              <w:right w:w="90" w:type="dxa"/>
-            </w:tcMar>
-            <w:vAlign w:val="center"/>
-          </w:tcPr>
-          <w:p>
-            <w:pPr>
-              <w:keepNext/>
-              <w:spacing w:before="80" w:after="80" w:line="240" w:lineRule="auto"/>
-              <w:rPr>
-                <w:rFonts w:ascii="Times New Roman" w:hAnsi="Times New Roman" w:cs="Times New Roman"/>
-              </w:rPr>
-            </w:pPr>
-            <w:r>
-              <w:rPr>
-                <w:rFonts w:ascii="Times New Roman" w:hAnsi="Times New Roman" w:cs="Times New Roman"/>
-                <w:sz w:val="20"/>
-              </w:rPr>
-              <w:t>8–20 minutes</w:t>
+              <w:t>Video lecture</w:t>
             </w:r>
           </w:p>
         </w:tc>
@@ -7110,7 +6932,7 @@
                 <w:rFonts w:ascii="Times New Roman" w:hAnsi="Times New Roman" w:cs="Times New Roman"/>
                 <w:sz w:val="20"/>
               </w:rPr>
-              <w:t>Clear speech, explanation and fitting visuals</w:t>
+              <w:t>A spoken, explained lesson on camera or as a recording. A useful range is about 8–20 minutes.</w:t>
             </w:r>
           </w:p>
         </w:tc>
@@ -7151,42 +6973,7 @@
                 <w:rFonts w:ascii="Times New Roman" w:hAnsi="Times New Roman" w:cs="Times New Roman"/>
                 <w:sz w:val="20"/>
               </w:rPr>
-              <w:t>Slide presentation and explanatory notes</w:t>
-            </w:r>
-          </w:p>
-        </w:tc>
-        <w:tc>
-          <w:tcPr>
-            <w:tcW w:w="1944" w:type="dxa"/>
-            <w:tcBorders>
-              <w:top w:val="single" w:sz="4" w:space="0" w:color="D9D9D9"/>
-              <w:left w:val="single" w:sz="4" w:space="0" w:color="D9D9D9"/>
-              <w:bottom w:val="single" w:sz="4" w:space="0" w:color="D9D9D9"/>
-              <w:right w:val="single" w:sz="4" w:space="0" w:color="D9D9D9"/>
-            </w:tcBorders>
-            <w:shd w:val="clear" w:color="auto" w:fill="FFFFFF"/>
-            <w:tcMar>
-              <w:top w:w="90" w:type="dxa"/>
-              <w:left w:w="90" w:type="dxa"/>
-              <w:bottom w:w="90" w:type="dxa"/>
-              <w:right w:w="90" w:type="dxa"/>
-            </w:tcMar>
-            <w:vAlign w:val="center"/>
-          </w:tcPr>
-          <w:p>
-            <w:pPr>
-              <w:keepNext/>
-              <w:spacing w:before="80" w:after="80" w:line="240" w:lineRule="auto"/>
-              <w:rPr>
-                <w:rFonts w:ascii="Times New Roman" w:hAnsi="Times New Roman" w:cs="Times New Roman"/>
-              </w:rPr>
-            </w:pPr>
-            <w:r>
-              <w:rPr>
-                <w:rFonts w:ascii="Times New Roman" w:hAnsi="Times New Roman" w:cs="Times New Roman"/>
-                <w:sz w:val="20"/>
-              </w:rPr>
-              <w:t>15–30 slides</w:t>
+              <w:t>Presentation</w:t>
             </w:r>
           </w:p>
         </w:tc>
@@ -7221,7 +7008,7 @@
                 <w:rFonts w:ascii="Times New Roman" w:hAnsi="Times New Roman" w:cs="Times New Roman"/>
                 <w:sz w:val="20"/>
               </w:rPr>
-              <w:t>Sequence, diagrams and explanatory notes</w:t>
+              <w:t>Slides with notes that walk the audience through the idea step by step. A useful range is about 15–30 slides.</w:t>
             </w:r>
           </w:p>
         </w:tc>
@@ -7261,41 +7048,7 @@
                 <w:rFonts w:ascii="Times New Roman" w:hAnsi="Times New Roman" w:cs="Times New Roman"/>
                 <w:sz w:val="20"/>
               </w:rPr>
-              <w:t>Combined teaching pack</w:t>
-            </w:r>
-          </w:p>
-        </w:tc>
-        <w:tc>
-          <w:tcPr>
-            <w:tcW w:w="1944" w:type="dxa"/>
-            <w:tcBorders>
-              <w:top w:val="single" w:sz="4" w:space="0" w:color="D9D9D9"/>
-              <w:left w:val="single" w:sz="4" w:space="0" w:color="D9D9D9"/>
-              <w:bottom w:val="single" w:sz="4" w:space="0" w:color="D9D9D9"/>
-              <w:right w:val="single" w:sz="4" w:space="0" w:color="D9D9D9"/>
-            </w:tcBorders>
-            <w:shd w:val="clear" w:color="auto" w:fill="F5F7F9"/>
-            <w:tcMar>
-              <w:top w:w="90" w:type="dxa"/>
-              <w:left w:w="90" w:type="dxa"/>
-              <w:bottom w:w="90" w:type="dxa"/>
-              <w:right w:w="90" w:type="dxa"/>
-            </w:tcMar>
-            <w:vAlign w:val="center"/>
-          </w:tcPr>
-          <w:p>
-            <w:pPr>
-              <w:spacing w:before="80" w:after="80" w:line="240" w:lineRule="auto"/>
-              <w:rPr>
-                <w:rFonts w:ascii="Times New Roman" w:hAnsi="Times New Roman" w:cs="Times New Roman"/>
-              </w:rPr>
-            </w:pPr>
-            <w:r>
-              <w:rPr>
-                <w:rFonts w:ascii="Times New Roman" w:hAnsi="Times New Roman" w:cs="Times New Roman"/>
-                <w:sz w:val="20"/>
-              </w:rPr>
-              <w:t>To be agreed separately</w:t>
+              <w:t>Teaching pack</w:t>
             </w:r>
           </w:p>
         </w:tc>
@@ -7329,7 +7082,405 @@
                 <w:rFonts w:ascii="Times New Roman" w:hAnsi="Times New Roman" w:cs="Times New Roman"/>
                 <w:sz w:val="20"/>
               </w:rPr>
-              <w:t>A combination of text, slides, video, code, exercises and interactive examples</w:t>
+              <w:t>A combined set of materials — for example text, slides, video and exercises — whose volume is agreed separately.</w:t>
+            </w:r>
+          </w:p>
+        </w:tc>
+      </w:tr>
+      <w:tr>
+        <w:trPr>
+          <w:cantSplit/>
+          <w:jc w:val="center"/>
+        </w:trPr>
+        <w:tc>
+          <w:tcPr>
+            <w:tcW w:w="3024" w:type="dxa"/>
+            <w:tcBorders>
+              <w:top w:val="single" w:sz="4" w:space="0" w:color="D9D9D9"/>
+              <w:left w:val="single" w:sz="4" w:space="0" w:color="D9D9D9"/>
+              <w:bottom w:val="single" w:sz="4" w:space="0" w:color="D9D9D9"/>
+              <w:right w:val="single" w:sz="4" w:space="0" w:color="D9D9D9"/>
+            </w:tcBorders>
+            <w:shd w:val="clear" w:color="auto" w:fill="F5F7F9"/>
+            <w:tcMar>
+              <w:top w:w="90" w:type="dxa"/>
+              <w:left w:w="90" w:type="dxa"/>
+              <w:bottom w:w="90" w:type="dxa"/>
+              <w:right w:w="90" w:type="dxa"/>
+            </w:tcMar>
+            <w:vAlign w:val="center"/>
+          </w:tcPr>
+          <w:p>
+            <w:pPr>
+              <w:spacing w:before="80" w:after="80" w:line="240" w:lineRule="auto"/>
+              <w:rPr>
+                <w:rFonts w:ascii="Times New Roman" w:hAnsi="Times New Roman" w:cs="Times New Roman"/>
+              </w:rPr>
+            </w:pPr>
+            <w:r>
+              <w:rPr>
+                <w:rFonts w:ascii="Times New Roman" w:hAnsi="Times New Roman" w:cs="Times New Roman"/>
+                <w:sz w:val="20"/>
+              </w:rPr>
+              <w:t>Educational cartoon</w:t>
+            </w:r>
+          </w:p>
+        </w:tc>
+        <w:tc>
+          <w:tcPr>
+            <w:tcW w:w="4968" w:type="dxa"/>
+            <w:tcBorders>
+              <w:top w:val="single" w:sz="4" w:space="0" w:color="D9D9D9"/>
+              <w:left w:val="single" w:sz="4" w:space="0" w:color="D9D9D9"/>
+              <w:bottom w:val="single" w:sz="4" w:space="0" w:color="D9D9D9"/>
+              <w:right w:val="single" w:sz="4" w:space="0" w:color="D9D9D9"/>
+            </w:tcBorders>
+            <w:shd w:val="clear" w:color="auto" w:fill="F5F7F9"/>
+            <w:tcMar>
+              <w:top w:w="90" w:type="dxa"/>
+              <w:left w:w="90" w:type="dxa"/>
+              <w:bottom w:w="90" w:type="dxa"/>
+              <w:right w:w="90" w:type="dxa"/>
+            </w:tcMar>
+            <w:vAlign w:val="center"/>
+          </w:tcPr>
+          <w:p>
+            <w:pPr>
+              <w:spacing w:before="80" w:after="80" w:line="240" w:lineRule="auto"/>
+              <w:rPr>
+                <w:rFonts w:ascii="Times New Roman" w:hAnsi="Times New Roman" w:cs="Times New Roman"/>
+              </w:rPr>
+            </w:pPr>
+            <w:r>
+              <w:rPr>
+                <w:rFonts w:ascii="Times New Roman" w:hAnsi="Times New Roman" w:cs="Times New Roman"/>
+                <w:sz w:val="20"/>
+              </w:rPr>
+              <w:t xml:space="preserve">A </w:t>
+            </w:r>
+            <w:r>
+              <w:rPr>
+                <w:rFonts w:ascii="Times New Roman" w:hAnsi="Times New Roman" w:cs="Times New Roman"/>
+                <w:sz w:val="20"/>
+              </w:rPr>
+              <w:t>short, illustrated</w:t>
+            </w:r>
+            <w:r>
+              <w:rPr>
+                <w:rFonts w:ascii="Times New Roman" w:hAnsi="Times New Roman" w:cs="Times New Roman"/>
+                <w:sz w:val="20"/>
+              </w:rPr>
+              <w:t xml:space="preserve"> story or cartoon sequence that teaches the topic without weakening the science.</w:t>
+            </w:r>
+          </w:p>
+        </w:tc>
+      </w:tr>
+      <w:tr>
+        <w:trPr>
+          <w:cantSplit/>
+          <w:jc w:val="center"/>
+        </w:trPr>
+        <w:tc>
+          <w:tcPr>
+            <w:tcW w:w="3024" w:type="dxa"/>
+            <w:tcBorders>
+              <w:top w:val="single" w:sz="4" w:space="0" w:color="D9D9D9"/>
+              <w:left w:val="single" w:sz="4" w:space="0" w:color="D9D9D9"/>
+              <w:bottom w:val="single" w:sz="4" w:space="0" w:color="D9D9D9"/>
+              <w:right w:val="single" w:sz="4" w:space="0" w:color="D9D9D9"/>
+            </w:tcBorders>
+            <w:shd w:val="clear" w:color="auto" w:fill="F5F7F9"/>
+            <w:tcMar>
+              <w:top w:w="90" w:type="dxa"/>
+              <w:left w:w="90" w:type="dxa"/>
+              <w:bottom w:w="90" w:type="dxa"/>
+              <w:right w:w="90" w:type="dxa"/>
+            </w:tcMar>
+            <w:vAlign w:val="center"/>
+          </w:tcPr>
+          <w:p>
+            <w:pPr>
+              <w:spacing w:before="80" w:after="80" w:line="240" w:lineRule="auto"/>
+              <w:rPr>
+                <w:rFonts w:ascii="Times New Roman" w:hAnsi="Times New Roman" w:cs="Times New Roman"/>
+              </w:rPr>
+            </w:pPr>
+            <w:r>
+              <w:rPr>
+                <w:rFonts w:ascii="Times New Roman" w:hAnsi="Times New Roman" w:cs="Times New Roman"/>
+                <w:sz w:val="20"/>
+              </w:rPr>
+              <w:t>Animation</w:t>
+            </w:r>
+          </w:p>
+        </w:tc>
+        <w:tc>
+          <w:tcPr>
+            <w:tcW w:w="4968" w:type="dxa"/>
+            <w:tcBorders>
+              <w:top w:val="single" w:sz="4" w:space="0" w:color="D9D9D9"/>
+              <w:left w:val="single" w:sz="4" w:space="0" w:color="D9D9D9"/>
+              <w:bottom w:val="single" w:sz="4" w:space="0" w:color="D9D9D9"/>
+              <w:right w:val="single" w:sz="4" w:space="0" w:color="D9D9D9"/>
+            </w:tcBorders>
+            <w:shd w:val="clear" w:color="auto" w:fill="F5F7F9"/>
+            <w:tcMar>
+              <w:top w:w="90" w:type="dxa"/>
+              <w:left w:w="90" w:type="dxa"/>
+              <w:bottom w:w="90" w:type="dxa"/>
+              <w:right w:w="90" w:type="dxa"/>
+            </w:tcMar>
+            <w:vAlign w:val="center"/>
+          </w:tcPr>
+          <w:p>
+            <w:pPr>
+              <w:spacing w:before="80" w:after="80" w:line="240" w:lineRule="auto"/>
+              <w:rPr>
+                <w:rFonts w:ascii="Times New Roman" w:hAnsi="Times New Roman" w:cs="Times New Roman"/>
+              </w:rPr>
+            </w:pPr>
+            <w:r>
+              <w:rPr>
+                <w:rFonts w:ascii="Times New Roman" w:hAnsi="Times New Roman" w:cs="Times New Roman"/>
+                <w:sz w:val="20"/>
+              </w:rPr>
+              <w:t>A moving visual explanation of a process, idea or system, with or without narration.</w:t>
+            </w:r>
+          </w:p>
+        </w:tc>
+      </w:tr>
+      <w:tr>
+        <w:trPr>
+          <w:cantSplit/>
+          <w:jc w:val="center"/>
+        </w:trPr>
+        <w:tc>
+          <w:tcPr>
+            <w:tcW w:w="3024" w:type="dxa"/>
+            <w:tcBorders>
+              <w:top w:val="single" w:sz="4" w:space="0" w:color="D9D9D9"/>
+              <w:left w:val="single" w:sz="4" w:space="0" w:color="D9D9D9"/>
+              <w:bottom w:val="single" w:sz="4" w:space="0" w:color="D9D9D9"/>
+              <w:right w:val="single" w:sz="4" w:space="0" w:color="D9D9D9"/>
+            </w:tcBorders>
+            <w:shd w:val="clear" w:color="auto" w:fill="F5F7F9"/>
+            <w:tcMar>
+              <w:top w:w="90" w:type="dxa"/>
+              <w:left w:w="90" w:type="dxa"/>
+              <w:bottom w:w="90" w:type="dxa"/>
+              <w:right w:w="90" w:type="dxa"/>
+            </w:tcMar>
+            <w:vAlign w:val="center"/>
+          </w:tcPr>
+          <w:p>
+            <w:pPr>
+              <w:spacing w:before="80" w:after="80" w:line="240" w:lineRule="auto"/>
+              <w:rPr>
+                <w:rFonts w:ascii="Times New Roman" w:hAnsi="Times New Roman" w:cs="Times New Roman"/>
+              </w:rPr>
+            </w:pPr>
+            <w:r>
+              <w:rPr>
+                <w:rFonts w:ascii="Times New Roman" w:hAnsi="Times New Roman" w:cs="Times New Roman"/>
+                <w:sz w:val="20"/>
+              </w:rPr>
+              <w:t>Comic</w:t>
+            </w:r>
+          </w:p>
+        </w:tc>
+        <w:tc>
+          <w:tcPr>
+            <w:tcW w:w="4968" w:type="dxa"/>
+            <w:tcBorders>
+              <w:top w:val="single" w:sz="4" w:space="0" w:color="D9D9D9"/>
+              <w:left w:val="single" w:sz="4" w:space="0" w:color="D9D9D9"/>
+              <w:bottom w:val="single" w:sz="4" w:space="0" w:color="D9D9D9"/>
+              <w:right w:val="single" w:sz="4" w:space="0" w:color="D9D9D9"/>
+            </w:tcBorders>
+            <w:shd w:val="clear" w:color="auto" w:fill="F5F7F9"/>
+            <w:tcMar>
+              <w:top w:w="90" w:type="dxa"/>
+              <w:left w:w="90" w:type="dxa"/>
+              <w:bottom w:w="90" w:type="dxa"/>
+              <w:right w:w="90" w:type="dxa"/>
+            </w:tcMar>
+            <w:vAlign w:val="center"/>
+          </w:tcPr>
+          <w:p>
+            <w:pPr>
+              <w:spacing w:before="80" w:after="80" w:line="240" w:lineRule="auto"/>
+              <w:rPr>
+                <w:rFonts w:ascii="Times New Roman" w:hAnsi="Times New Roman" w:cs="Times New Roman"/>
+              </w:rPr>
+            </w:pPr>
+            <w:r>
+              <w:rPr>
+                <w:rFonts w:ascii="Times New Roman" w:hAnsi="Times New Roman" w:cs="Times New Roman"/>
+                <w:sz w:val="20"/>
+              </w:rPr>
+              <w:t>A panel sequence of words and pictures that makes the topic easy to follow.</w:t>
+            </w:r>
+          </w:p>
+        </w:tc>
+      </w:tr>
+      <w:tr>
+        <w:trPr>
+          <w:cantSplit/>
+          <w:jc w:val="center"/>
+        </w:trPr>
+        <w:tc>
+          <w:tcPr>
+            <w:tcW w:w="3024" w:type="dxa"/>
+            <w:tcBorders>
+              <w:top w:val="single" w:sz="4" w:space="0" w:color="D9D9D9"/>
+              <w:left w:val="single" w:sz="4" w:space="0" w:color="D9D9D9"/>
+              <w:bottom w:val="single" w:sz="4" w:space="0" w:color="D9D9D9"/>
+              <w:right w:val="single" w:sz="4" w:space="0" w:color="D9D9D9"/>
+            </w:tcBorders>
+            <w:shd w:val="clear" w:color="auto" w:fill="F5F7F9"/>
+            <w:tcMar>
+              <w:top w:w="90" w:type="dxa"/>
+              <w:left w:w="90" w:type="dxa"/>
+              <w:bottom w:w="90" w:type="dxa"/>
+              <w:right w:w="90" w:type="dxa"/>
+            </w:tcMar>
+            <w:vAlign w:val="center"/>
+          </w:tcPr>
+          <w:p>
+            <w:pPr>
+              <w:spacing w:before="80" w:after="80" w:line="240" w:lineRule="auto"/>
+              <w:rPr>
+                <w:rFonts w:ascii="Times New Roman" w:hAnsi="Times New Roman" w:cs="Times New Roman"/>
+              </w:rPr>
+            </w:pPr>
+            <w:r>
+              <w:rPr>
+                <w:rFonts w:ascii="Times New Roman" w:hAnsi="Times New Roman" w:cs="Times New Roman"/>
+                <w:sz w:val="20"/>
+              </w:rPr>
+              <w:t>Infographic</w:t>
+            </w:r>
+          </w:p>
+        </w:tc>
+        <w:tc>
+          <w:tcPr>
+            <w:tcW w:w="4968" w:type="dxa"/>
+            <w:tcBorders>
+              <w:top w:val="single" w:sz="4" w:space="0" w:color="D9D9D9"/>
+              <w:left w:val="single" w:sz="4" w:space="0" w:color="D9D9D9"/>
+              <w:bottom w:val="single" w:sz="4" w:space="0" w:color="D9D9D9"/>
+              <w:right w:val="single" w:sz="4" w:space="0" w:color="D9D9D9"/>
+            </w:tcBorders>
+            <w:shd w:val="clear" w:color="auto" w:fill="F5F7F9"/>
+            <w:tcMar>
+              <w:top w:w="90" w:type="dxa"/>
+              <w:left w:w="90" w:type="dxa"/>
+              <w:bottom w:w="90" w:type="dxa"/>
+              <w:right w:w="90" w:type="dxa"/>
+            </w:tcMar>
+            <w:vAlign w:val="center"/>
+          </w:tcPr>
+          <w:p>
+            <w:pPr>
+              <w:spacing w:before="80" w:after="80" w:line="240" w:lineRule="auto"/>
+              <w:rPr>
+                <w:rFonts w:ascii="Times New Roman" w:hAnsi="Times New Roman" w:cs="Times New Roman"/>
+              </w:rPr>
+            </w:pPr>
+            <w:r>
+              <w:rPr>
+                <w:rFonts w:ascii="Times New Roman" w:hAnsi="Times New Roman" w:cs="Times New Roman"/>
+                <w:sz w:val="20"/>
+              </w:rPr>
+              <w:t xml:space="preserve">A designed visual that organises the key facts, steps or relations of the topic </w:t>
+            </w:r>
+            <w:r>
+              <w:rPr>
+                <w:rFonts w:ascii="Times New Roman" w:hAnsi="Times New Roman" w:cs="Times New Roman"/>
+                <w:sz w:val="20"/>
+              </w:rPr>
+              <w:t>briefly</w:t>
+            </w:r>
+            <w:r>
+              <w:rPr>
+                <w:rFonts w:ascii="Times New Roman" w:hAnsi="Times New Roman" w:cs="Times New Roman"/>
+                <w:sz w:val="20"/>
+              </w:rPr>
+              <w:t>.</w:t>
+            </w:r>
+          </w:p>
+        </w:tc>
+      </w:tr>
+      <w:tr>
+        <w:trPr>
+          <w:cantSplit/>
+          <w:jc w:val="center"/>
+        </w:trPr>
+        <w:tc>
+          <w:tcPr>
+            <w:tcW w:w="3024" w:type="dxa"/>
+            <w:tcBorders>
+              <w:top w:val="single" w:sz="4" w:space="0" w:color="D9D9D9"/>
+              <w:left w:val="single" w:sz="4" w:space="0" w:color="D9D9D9"/>
+              <w:bottom w:val="single" w:sz="4" w:space="0" w:color="D9D9D9"/>
+              <w:right w:val="single" w:sz="4" w:space="0" w:color="D9D9D9"/>
+            </w:tcBorders>
+            <w:shd w:val="clear" w:color="auto" w:fill="F5F7F9"/>
+            <w:tcMar>
+              <w:top w:w="90" w:type="dxa"/>
+              <w:left w:w="90" w:type="dxa"/>
+              <w:bottom w:w="90" w:type="dxa"/>
+              <w:right w:w="90" w:type="dxa"/>
+            </w:tcMar>
+            <w:vAlign w:val="center"/>
+          </w:tcPr>
+          <w:p>
+            <w:pPr>
+              <w:spacing w:before="80" w:after="80" w:line="240" w:lineRule="auto"/>
+              <w:rPr>
+                <w:rFonts w:ascii="Times New Roman" w:hAnsi="Times New Roman" w:cs="Times New Roman"/>
+              </w:rPr>
+            </w:pPr>
+            <w:r>
+              <w:rPr>
+                <w:rFonts w:ascii="Times New Roman" w:hAnsi="Times New Roman" w:cs="Times New Roman"/>
+                <w:sz w:val="20"/>
+              </w:rPr>
+              <w:t>Interactive material</w:t>
+            </w:r>
+          </w:p>
+        </w:tc>
+        <w:tc>
+          <w:tcPr>
+            <w:tcW w:w="4968" w:type="dxa"/>
+            <w:tcBorders>
+              <w:top w:val="single" w:sz="4" w:space="0" w:color="D9D9D9"/>
+              <w:left w:val="single" w:sz="4" w:space="0" w:color="D9D9D9"/>
+              <w:bottom w:val="single" w:sz="4" w:space="0" w:color="D9D9D9"/>
+              <w:right w:val="single" w:sz="4" w:space="0" w:color="D9D9D9"/>
+            </w:tcBorders>
+            <w:shd w:val="clear" w:color="auto" w:fill="F5F7F9"/>
+            <w:tcMar>
+              <w:top w:w="90" w:type="dxa"/>
+              <w:left w:w="90" w:type="dxa"/>
+              <w:bottom w:w="90" w:type="dxa"/>
+              <w:right w:w="90" w:type="dxa"/>
+            </w:tcMar>
+            <w:vAlign w:val="center"/>
+          </w:tcPr>
+          <w:p>
+            <w:pPr>
+              <w:spacing w:before="80" w:after="80" w:line="240" w:lineRule="auto"/>
+              <w:rPr>
+                <w:rFonts w:ascii="Times New Roman" w:hAnsi="Times New Roman" w:cs="Times New Roman"/>
+              </w:rPr>
+            </w:pPr>
+            <w:r>
+              <w:rPr>
+                <w:rFonts w:ascii="Times New Roman" w:hAnsi="Times New Roman" w:cs="Times New Roman"/>
+                <w:sz w:val="20"/>
+              </w:rPr>
+              <w:t>A clickable, coded or exercise-based resource that lets the learner try the idea, not only read it.</w:t>
             </w:r>
           </w:p>
         </w:tc>
@@ -7454,6 +7605,7 @@
         <w:rPr>
           <w:rFonts w:ascii="Times New Roman" w:hAnsi="Times New Roman" w:cs="Times New Roman"/>
         </w:rPr>
+        <w:lastRenderedPageBreak/>
         <w:t>Connect it to practice and to a real situation.</w:t>
       </w:r>
     </w:p>
@@ -7582,7 +7734,6 @@
         <w:rPr>
           <w:rFonts w:ascii="Times New Roman" w:hAnsi="Times New Roman" w:cs="Times New Roman"/>
         </w:rPr>
-        <w:lastRenderedPageBreak/>
         <w:t>4.4 Completing the technical rules</w:t>
       </w:r>
       <w:bookmarkEnd w:id="44"/>
@@ -7735,6 +7886,7 @@
         <w:rPr>
           <w:rFonts w:ascii="Times New Roman" w:hAnsi="Times New Roman" w:cs="Times New Roman"/>
         </w:rPr>
+        <w:lastRenderedPageBreak/>
         <w:t>5.3 Information and privacy</w:t>
       </w:r>
       <w:bookmarkEnd w:id="53"/>
@@ -7780,7 +7932,6 @@
         <w:rPr>
           <w:rFonts w:ascii="Times New Roman" w:hAnsi="Times New Roman" w:cs="Times New Roman"/>
         </w:rPr>
-        <w:lastRenderedPageBreak/>
         <w:t>6 Judging and the jury</w:t>
       </w:r>
       <w:bookmarkEnd w:id="55"/>
@@ -8792,6 +8943,7 @@
         <w:rPr>
           <w:rFonts w:ascii="Times New Roman" w:hAnsi="Times New Roman" w:cs="Times New Roman"/>
         </w:rPr>
+        <w:lastRenderedPageBreak/>
         <w:t>6.2 Expert review and the final</w:t>
       </w:r>
       <w:bookmarkEnd w:id="60"/>
@@ -8849,7 +9001,6 @@
         <w:rPr>
           <w:rFonts w:ascii="Times New Roman" w:hAnsi="Times New Roman" w:cs="Times New Roman"/>
         </w:rPr>
-        <w:lastRenderedPageBreak/>
         <w:t>6.3 Final score and the audience award</w:t>
       </w:r>
       <w:bookmarkEnd w:id="62"/>
@@ -9028,6 +9179,7 @@
         <w:rPr>
           <w:rFonts w:ascii="Times New Roman" w:hAnsi="Times New Roman" w:cs="Times New Roman"/>
         </w:rPr>
+        <w:lastRenderedPageBreak/>
         <w:t>7.2 DAAB Selected Lecture status</w:t>
       </w:r>
       <w:bookmarkEnd w:id="71"/>
@@ -9126,7 +9278,6 @@
         <w:rPr>
           <w:rFonts w:ascii="Times New Roman" w:hAnsi="Times New Roman" w:cs="Times New Roman"/>
         </w:rPr>
-        <w:lastRenderedPageBreak/>
         <w:t>A work with a critical scientific flaw should not receive this status, whatever its overall score. Whether the threshold applies to the first-round mark, the final competition score, or a re-assessment after editing is not fully clear in the source and must be confirmed.</w:t>
       </w:r>
     </w:p>
@@ -9308,6 +9459,7 @@
         <w:rPr>
           <w:rFonts w:ascii="Times New Roman" w:hAnsi="Times New Roman" w:cs="Times New Roman"/>
         </w:rPr>
+        <w:lastRenderedPageBreak/>
         <w:t>8.3 Publication and use rights</w:t>
       </w:r>
       <w:bookmarkEnd w:id="82"/>
@@ -9365,7 +9517,6 @@
         <w:rPr>
           <w:rFonts w:ascii="Times New Roman" w:hAnsi="Times New Roman" w:cs="Times New Roman"/>
         </w:rPr>
-        <w:lastRenderedPageBreak/>
         <w:t>8.4 Appeals and changes to the rules</w:t>
       </w:r>
       <w:bookmarkEnd w:id="84"/>
@@ -10167,7 +10318,6 @@
         <w:rPr>
           <w:rFonts w:ascii="Times New Roman" w:hAnsi="Times New Roman" w:cs="Times New Roman"/>
         </w:rPr>
-        <w:lastRenderedPageBreak/>
         <w:t>9.2 The proposed first cycle</w:t>
       </w:r>
       <w:bookmarkEnd w:id="91"/>
@@ -11215,7 +11365,14 @@
         <w:rPr>
           <w:rFonts w:ascii="Times New Roman" w:hAnsi="Times New Roman" w:cs="Times New Roman"/>
         </w:rPr>
-        <w:t>Each material page may show a title, the author and a short biography, topic category, level, audience, keywords and reading or viewing time. The page should give access to the article, PDF, video, slides, exercises, code samples, sources and related materials. Links such as “Watch”, “Read”, “Learn”, “Try” and “Go deeper” appear in the source as a presentation idea.</w:t>
+        <w:t xml:space="preserve">Each material page may show a title, the author and a short biography, topic category, level, audience, keywords and reading or viewing time. The page should give access to the article, PDF, video, slides, exercises, code </w:t>
+      </w:r>
+      <w:r>
+        <w:rPr>
+          <w:rFonts w:ascii="Times New Roman" w:hAnsi="Times New Roman" w:cs="Times New Roman"/>
+        </w:rPr>
+        <w:lastRenderedPageBreak/>
+        <w:t>samples, sources and related materials. Links such as “Watch”, “Read”, “Learn”, “Try” and “Go deeper” appear in the source as a presentation idea.</w:t>
       </w:r>
     </w:p>
     <w:p>
@@ -11231,7 +11388,6 @@
         <w:rPr>
           <w:rFonts w:ascii="Times New Roman" w:hAnsi="Times New Roman" w:cs="Times New Roman"/>
         </w:rPr>
-        <w:lastRenderedPageBreak/>
         <w:t>10.2 Editing and publication</w:t>
       </w:r>
       <w:bookmarkEnd w:id="100"/>
@@ -17617,13 +17773,7 @@
       <w:rPr>
         <w:sz w:val="18"/>
       </w:rPr>
-      <w:t>Working document</w:t>
-    </w:r>
-    <w:r>
-      <w:rPr>
-        <w:sz w:val="18"/>
-      </w:rPr>
-      <w:t xml:space="preserve"> |  </w:t>
+      <w:t xml:space="preserve">Working document |  </w:t>
     </w:r>
     <w:r>
       <w:fldChar w:fldCharType="begin"/>
@@ -17694,7 +17844,6 @@
         <w:bCs/>
         <w:sz w:val="24"/>
         <w:szCs w:val="24"/>
-        <w:lang/>
       </w:rPr>
       <w:t>Complex Topics, Clear Explanations</w:t>
     </w:r>
@@ -17760,7 +17909,7 @@
         </mc:Choice>
         <mc:Fallback>
           <w:pict>
-            <v:line w14:anchorId="2AB1568E" id="Straight Connector 1" o:spid="_x0000_s1026" style="position:absolute;z-index:251668480;visibility:visible;mso-wrap-style:square;mso-wrap-distance-left:9pt;mso-wrap-distance-top:0;mso-wrap-distance-right:9pt;mso-wrap-distance-bottom:0;mso-position-horizontal:absolute;mso-position-horizontal-relative:text;mso-position-vertical:absolute;mso-position-vertical-relative:text" from=".9pt,4.3pt" to="495.15pt,6.55pt" o:gfxdata="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" strokecolor="black [3040]" strokeweight=".25pt"/>
+            <v:line w14:anchorId="6AC63FBB" id="Straight Connector 1" o:spid="_x0000_s1026" style="position:absolute;z-index:251668480;visibility:visible;mso-wrap-style:square;mso-wrap-distance-left:9pt;mso-wrap-distance-top:0;mso-wrap-distance-right:9pt;mso-wrap-distance-bottom:0;mso-position-horizontal:absolute;mso-position-horizontal-relative:text;mso-position-vertical:absolute;mso-position-vertical-relative:text" from=".9pt,4.3pt" to="495.15pt,6.55pt" o:gfxdata="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" strokecolor="black [3040]" strokeweight=".25pt"/>
           </w:pict>
         </mc:Fallback>
       </mc:AlternateContent>
@@ -18579,6 +18728,7 @@
   <w:style w:type="character" w:default="1" w:styleId="DefaultParagraphFont">
     <w:name w:val="Default Paragraph Font"/>
     <w:uiPriority w:val="1"/>
+    <w:semiHidden/>
     <w:unhideWhenUsed/>
   </w:style>
   <w:style w:type="table" w:default="1" w:styleId="TableNormal">

</xml_diff>